<commit_message>
docs: finish PRD v1.2 (title, date, footer), record plan deviations
</commit_message>
<xml_diff>
--- a/docs/PRD-v1.2.docx
+++ b/docs/PRD-v1.2.docx
@@ -11,7 +11,7 @@
         <w:rPr>
           <w:rFonts w:eastAsia="宋体" w:ascii="Microsoft YaHei" w:hAnsi="Microsoft YaHei"/>
         </w:rPr>
-        <w:t>霓虹贪吃蛇 · 产品需求文档（PRD）v1.1</w:t>
+        <w:t>霓虹贪吃蛇 · 产品需求文档（PRD）v1.2</w:t>
       </w:r>
     </w:p>
     <w:p>
@@ -225,7 +225,7 @@
                 <w:sz w:val="17"/>
                 <w:rFonts w:eastAsia="宋体" w:ascii="Microsoft YaHei" w:hAnsi="Microsoft YaHei"/>
               </w:rPr>
-              <w:t>同类复刻普遍手感粗糙（跳格、无音效、手机不能玩、打开慢）——本作用固定步长+插值、合成音效、50KB 零外部请求来对冲</w:t>
+              <w:t>同类复刻普遍手感粗糙（跳格、无音效、手机不能玩、打开慢）——本作用固定步长+插值、合成音效、53KB 零外部请求来对冲</w:t>
             </w:r>
           </w:p>
         </w:tc>
@@ -463,7 +463,7 @@
                 <w:sz w:val="17"/>
                 <w:rFonts w:eastAsia="宋体" w:ascii="Microsoft YaHei" w:hAnsi="Microsoft YaHei"/>
               </w:rPr>
-              <w:t>v1.1（替换 v1.0）</w:t>
+              <w:t>v1.2（替换 v1.1）</w:t>
             </w:r>
           </w:p>
         </w:tc>
@@ -655,7 +655,7 @@
                 <w:sz w:val="17"/>
                 <w:rFonts w:eastAsia="宋体" w:ascii="Microsoft YaHei" w:hAnsi="Microsoft YaHei"/>
               </w:rPr>
-              <w:t>2026-10-21</w:t>
+              <w:t>2026-10-22</w:t>
             </w:r>
           </w:p>
         </w:tc>
@@ -1181,7 +1181,7 @@
                 <w:sz w:val="17"/>
                 <w:rFonts w:eastAsia="宋体" w:ascii="Microsoft YaHei" w:hAnsi="Microsoft YaHei"/>
               </w:rPr>
-              <w:t>2026-10-20</w:t>
+              <w:t>2026-10-22</w:t>
             </w:r>
           </w:p>
         </w:tc>
@@ -1196,7 +1196,7 @@
                 <w:sz w:val="17"/>
                 <w:rFonts w:eastAsia="宋体" w:ascii="Microsoft YaHei" w:hAnsi="Microsoft YaHei"/>
               </w:rPr>
-              <w:t xml:space="preserve">一期补强 P0 落地：FR-0 规则层与 36 例单测、FR-7.4 缺陷修复、第 11 节埋点本地聚合（FR-8.2）、OG 图改绝对地址（FR-11.1）、FR-6.3 暂停挂音、FR-10.5 可访问性边界；AC-1 命令改为 glob（Node 24 不接受目录参数）；新增 </w:t>
+              <w:t xml:space="preserve">一期补强 P0 落地：FR-0 规则层与 40 例单测、FR-7.4 缺陷修复、第 11 节埋点本地聚合（FR-8.2）、OG 图改绝对地址（FR-11.1）、FR-6.3 暂停挂音、FR-6.1 暂停冻结连击与金果实计时、FR-10.5 可访问性边界；AC-1 命令改为 glob（Node 24 不接受目录参数）；新增 </w:t>
             </w:r>
             <w:r>
               <w:rPr>
@@ -6202,7 +6202,7 @@
                 <w:sz w:val="17"/>
                 <w:rFonts w:eastAsia="宋体" w:ascii="Microsoft YaHei" w:hAnsi="Microsoft YaHei"/>
               </w:rPr>
-              <w:t xml:space="preserve"> 全绿，36 例</w:t>
+              <w:t xml:space="preserve"> 全绿，40 例</w:t>
             </w:r>
           </w:p>
         </w:tc>
@@ -8973,7 +8973,21 @@
                 <w:sz w:val="17"/>
                 <w:rFonts w:eastAsia="宋体" w:ascii="Microsoft YaHei" w:hAnsi="Microsoft YaHei"/>
               </w:rPr>
-              <w:t>恢复不跳步</w:t>
+              <w:t>恢复不跳步；连击窗口与金果实寿命冻结（</w:t>
+            </w:r>
+            <w:r>
+              <w:rPr>
+                <w:rFonts w:ascii="Consolas" w:hAnsi="Consolas" w:eastAsia="宋体"/>
+                <w:sz w:val="17"/>
+              </w:rPr>
+              <w:t>shiftTimers</w:t>
+            </w:r>
+            <w:r>
+              <w:rPr>
+                <w:sz w:val="17"/>
+                <w:rFonts w:eastAsia="宋体" w:ascii="Microsoft YaHei" w:hAnsi="Microsoft YaHei"/>
+              </w:rPr>
+              <w:t>）</w:t>
             </w:r>
           </w:p>
         </w:tc>
@@ -12959,7 +12973,7 @@
                 <w:sz w:val="17"/>
                 <w:rFonts w:eastAsia="宋体" w:ascii="Microsoft YaHei" w:hAnsi="Microsoft YaHei"/>
               </w:rPr>
-              <w:t>首屏 ≤60KB（当前 50KB）</w:t>
+              <w:t>首屏 ≤60KB（当前 53KB）</w:t>
             </w:r>
           </w:p>
         </w:tc>
@@ -17102,7 +17116,7 @@
                 <w:sz w:val="17"/>
                 <w:rFonts w:eastAsia="宋体" w:ascii="Microsoft YaHei" w:hAnsi="Microsoft YaHei"/>
               </w:rPr>
-              <w:t>全绿，用例 ≥12（当前 36）</w:t>
+              <w:t>全绿，用例 ≥12（当前 40）</w:t>
             </w:r>
           </w:p>
         </w:tc>
@@ -19423,7 +19437,7 @@
         <w:sz w:val="17"/>
         <w:rFonts w:eastAsia="宋体" w:ascii="Microsoft YaHei" w:hAnsi="Microsoft YaHei"/>
       </w:rPr>
-      <w:t xml:space="preserve">产品需求文档 v1.0　·　第 </w:t>
+      <w:t xml:space="preserve">产品需求文档 v1.2　·　第 </w:t>
     </w:r>
     <w:fldSimple w:instr="PAGE"/>
     <w:r>

</xml_diff>

<commit_message>
fix(audio): raise SFX into the NFR-6 budget and make silence self-explaining
Measured with a CDP probe (real click, http and file://): the graph was
alive but each sound peaked around -27 dBFS, ~15 dB below the -12 dBFS
budget, and a persisted mute or a browser-blocked context produced no
feedback beyond the icon.

- keep per-sound gain inside the budget (0.13-0.20) and route everything
  through a -12 dBFS DynamicsCompressor limiter
- HUD shows '音效已关闭' when muted and '点一下开启音效' when the context
  is blocked; a blocked blip is replayed once the context resumes
- expose soundCount()/muted()/audioBlocked()/audioMaster() for diagnosis
- e2e S8/S9: sounds actually scheduled, muted is silent and visible,
  limiter wired, 375px hint does not break layout
</commit_message>
<xml_diff>
--- a/docs/PRD-v1.2.docx
+++ b/docs/PRD-v1.2.docx
@@ -1210,7 +1210,7 @@
                 <w:sz w:val="17"/>
                 <w:rFonts w:eastAsia="宋体" w:ascii="Microsoft YaHei" w:hAnsi="Microsoft YaHei"/>
               </w:rPr>
-              <w:t xml:space="preserve"> 验收脚本</w:t>
+              <w:t xml:space="preserve"> 验收脚本。补充：音效电平按 NFR-6 预算上调并加 -12 dBFS 限幅器，静音/被拦截时 HUD 给文字提示并补播，新增音效端到端验收（S8/S9）</w:t>
             </w:r>
           </w:p>
         </w:tc>
@@ -14334,15 +14334,16 @@
         <w:tblLook w:firstColumn="1" w:firstRow="1" w:lastColumn="0" w:lastRow="0" w:noHBand="0" w:noVBand="1" w:val="04A0"/>
       </w:tblPr>
       <w:tblGrid>
-        <w:gridCol w:w="2296"/>
-        <w:gridCol w:w="2296"/>
-        <w:gridCol w:w="2296"/>
-        <w:gridCol w:w="2296"/>
+        <w:gridCol w:w="1837"/>
+        <w:gridCol w:w="1837"/>
+        <w:gridCol w:w="1837"/>
+        <w:gridCol w:w="1837"/>
+        <w:gridCol w:w="1837"/>
       </w:tblGrid>
       <w:tr>
         <w:tc>
           <w:tcPr>
-            <w:tcW w:type="dxa" w:w="2296"/>
+            <w:tcW w:type="dxa" w:w="1837"/>
             <w:shd w:val="clear" w:color="auto" w:fill="EFE5D2"/>
           </w:tcPr>
           <w:p>
@@ -14363,7 +14364,7 @@
         </w:tc>
         <w:tc>
           <w:tcPr>
-            <w:tcW w:type="dxa" w:w="2296"/>
+            <w:tcW w:type="dxa" w:w="1837"/>
             <w:shd w:val="clear" w:color="auto" w:fill="EFE5D2"/>
           </w:tcPr>
           <w:p>
@@ -14384,7 +14385,7 @@
         </w:tc>
         <w:tc>
           <w:tcPr>
-            <w:tcW w:type="dxa" w:w="2296"/>
+            <w:tcW w:type="dxa" w:w="1837"/>
             <w:shd w:val="clear" w:color="auto" w:fill="EFE5D2"/>
           </w:tcPr>
           <w:p>
@@ -14405,7 +14406,7 @@
         </w:tc>
         <w:tc>
           <w:tcPr>
-            <w:tcW w:type="dxa" w:w="2296"/>
+            <w:tcW w:type="dxa" w:w="1837"/>
             <w:shd w:val="clear" w:color="auto" w:fill="EFE5D2"/>
           </w:tcPr>
           <w:p>
@@ -14421,6 +14422,27 @@
                 <w:rFonts w:eastAsia="宋体" w:ascii="Microsoft YaHei" w:hAnsi="Microsoft YaHei"/>
               </w:rPr>
               <w:t>时长</w:t>
+            </w:r>
+          </w:p>
+        </w:tc>
+        <w:tc>
+          <w:tcPr>
+            <w:tcW w:type="dxa" w:w="1837"/>
+            <w:shd w:val="clear" w:color="auto" w:fill="EFE5D2"/>
+          </w:tcPr>
+          <w:p>
+            <w:r>
+              <w:rPr>
+                <w:b/>
+              </w:rPr>
+            </w:r>
+            <w:r>
+              <w:rPr>
+                <w:b/>
+                <w:sz w:val="17"/>
+                <w:rFonts w:eastAsia="宋体" w:ascii="Microsoft YaHei" w:hAnsi="Microsoft YaHei"/>
+              </w:rPr>
+              <w:t>单音 gain</w:t>
             </w:r>
           </w:p>
         </w:tc>
@@ -14428,7 +14450,7 @@
       <w:tr>
         <w:tc>
           <w:tcPr>
-            <w:tcW w:type="dxa" w:w="2296"/>
+            <w:tcW w:type="dxa" w:w="1837"/>
           </w:tcPr>
           <w:p>
             <w:r/>
@@ -14443,7 +14465,7 @@
         </w:tc>
         <w:tc>
           <w:tcPr>
-            <w:tcW w:type="dxa" w:w="2296"/>
+            <w:tcW w:type="dxa" w:w="1837"/>
           </w:tcPr>
           <w:p>
             <w:r/>
@@ -14458,7 +14480,7 @@
         </w:tc>
         <w:tc>
           <w:tcPr>
-            <w:tcW w:type="dxa" w:w="2296"/>
+            <w:tcW w:type="dxa" w:w="1837"/>
           </w:tcPr>
           <w:p>
             <w:r/>
@@ -14473,7 +14495,7 @@
         </w:tc>
         <w:tc>
           <w:tcPr>
-            <w:tcW w:type="dxa" w:w="2296"/>
+            <w:tcW w:type="dxa" w:w="1837"/>
           </w:tcPr>
           <w:p>
             <w:r/>
@@ -14483,6 +14505,21 @@
                 <w:rFonts w:eastAsia="宋体" w:ascii="Microsoft YaHei" w:hAnsi="Microsoft YaHei"/>
               </w:rPr>
               <w:t>0.16s</w:t>
+            </w:r>
+          </w:p>
+        </w:tc>
+        <w:tc>
+          <w:tcPr>
+            <w:tcW w:type="dxa" w:w="1837"/>
+          </w:tcPr>
+          <w:p>
+            <w:r/>
+            <w:r>
+              <w:rPr>
+                <w:sz w:val="17"/>
+                <w:rFonts w:eastAsia="宋体" w:ascii="Microsoft YaHei" w:hAnsi="Microsoft YaHei"/>
+              </w:rPr>
+              <w:t>0.18</w:t>
             </w:r>
           </w:p>
         </w:tc>
@@ -14490,7 +14527,7 @@
       <w:tr>
         <w:tc>
           <w:tcPr>
-            <w:tcW w:type="dxa" w:w="2296"/>
+            <w:tcW w:type="dxa" w:w="1837"/>
           </w:tcPr>
           <w:p>
             <w:r/>
@@ -14505,7 +14542,7 @@
         </w:tc>
         <w:tc>
           <w:tcPr>
-            <w:tcW w:type="dxa" w:w="2296"/>
+            <w:tcW w:type="dxa" w:w="1837"/>
           </w:tcPr>
           <w:p>
             <w:r/>
@@ -14520,7 +14557,7 @@
         </w:tc>
         <w:tc>
           <w:tcPr>
-            <w:tcW w:type="dxa" w:w="2296"/>
+            <w:tcW w:type="dxa" w:w="1837"/>
           </w:tcPr>
           <w:p>
             <w:r/>
@@ -14535,7 +14572,7 @@
         </w:tc>
         <w:tc>
           <w:tcPr>
-            <w:tcW w:type="dxa" w:w="2296"/>
+            <w:tcW w:type="dxa" w:w="1837"/>
           </w:tcPr>
           <w:p>
             <w:r/>
@@ -14545,6 +14582,21 @@
                 <w:rFonts w:eastAsia="宋体" w:ascii="Microsoft YaHei" w:hAnsi="Microsoft YaHei"/>
               </w:rPr>
               <w:t>0.10s</w:t>
+            </w:r>
+          </w:p>
+        </w:tc>
+        <w:tc>
+          <w:tcPr>
+            <w:tcW w:type="dxa" w:w="1837"/>
+          </w:tcPr>
+          <w:p>
+            <w:r/>
+            <w:r>
+              <w:rPr>
+                <w:sz w:val="17"/>
+                <w:rFonts w:eastAsia="宋体" w:ascii="Microsoft YaHei" w:hAnsi="Microsoft YaHei"/>
+              </w:rPr>
+              <w:t>0.14</w:t>
             </w:r>
           </w:p>
         </w:tc>
@@ -14552,7 +14604,7 @@
       <w:tr>
         <w:tc>
           <w:tcPr>
-            <w:tcW w:type="dxa" w:w="2296"/>
+            <w:tcW w:type="dxa" w:w="1837"/>
           </w:tcPr>
           <w:p>
             <w:r/>
@@ -14567,7 +14619,7 @@
         </w:tc>
         <w:tc>
           <w:tcPr>
-            <w:tcW w:type="dxa" w:w="2296"/>
+            <w:tcW w:type="dxa" w:w="1837"/>
           </w:tcPr>
           <w:p>
             <w:r/>
@@ -14582,7 +14634,7 @@
         </w:tc>
         <w:tc>
           <w:tcPr>
-            <w:tcW w:type="dxa" w:w="2296"/>
+            <w:tcW w:type="dxa" w:w="1837"/>
           </w:tcPr>
           <w:p>
             <w:r/>
@@ -14597,7 +14649,7 @@
         </w:tc>
         <w:tc>
           <w:tcPr>
-            <w:tcW w:type="dxa" w:w="2296"/>
+            <w:tcW w:type="dxa" w:w="1837"/>
           </w:tcPr>
           <w:p>
             <w:r/>
@@ -14607,6 +14659,21 @@
                 <w:rFonts w:eastAsia="宋体" w:ascii="Microsoft YaHei" w:hAnsi="Microsoft YaHei"/>
               </w:rPr>
               <w:t>0.09–0.12s</w:t>
+            </w:r>
+          </w:p>
+        </w:tc>
+        <w:tc>
+          <w:tcPr>
+            <w:tcW w:type="dxa" w:w="1837"/>
+          </w:tcPr>
+          <w:p>
+            <w:r/>
+            <w:r>
+              <w:rPr>
+                <w:sz w:val="17"/>
+                <w:rFonts w:eastAsia="宋体" w:ascii="Microsoft YaHei" w:hAnsi="Microsoft YaHei"/>
+              </w:rPr>
+              <w:t>0.13</w:t>
             </w:r>
           </w:p>
         </w:tc>
@@ -14614,7 +14681,7 @@
       <w:tr>
         <w:tc>
           <w:tcPr>
-            <w:tcW w:type="dxa" w:w="2296"/>
+            <w:tcW w:type="dxa" w:w="1837"/>
           </w:tcPr>
           <w:p>
             <w:r/>
@@ -14629,7 +14696,7 @@
         </w:tc>
         <w:tc>
           <w:tcPr>
-            <w:tcW w:type="dxa" w:w="2296"/>
+            <w:tcW w:type="dxa" w:w="1837"/>
           </w:tcPr>
           <w:p>
             <w:r/>
@@ -14644,7 +14711,7 @@
         </w:tc>
         <w:tc>
           <w:tcPr>
-            <w:tcW w:type="dxa" w:w="2296"/>
+            <w:tcW w:type="dxa" w:w="1837"/>
           </w:tcPr>
           <w:p>
             <w:r/>
@@ -14659,7 +14726,7 @@
         </w:tc>
         <w:tc>
           <w:tcPr>
-            <w:tcW w:type="dxa" w:w="2296"/>
+            <w:tcW w:type="dxa" w:w="1837"/>
           </w:tcPr>
           <w:p>
             <w:r/>
@@ -14669,6 +14736,21 @@
                 <w:rFonts w:eastAsia="宋体" w:ascii="Microsoft YaHei" w:hAnsi="Microsoft YaHei"/>
               </w:rPr>
               <w:t>0.42s</w:t>
+            </w:r>
+          </w:p>
+        </w:tc>
+        <w:tc>
+          <w:tcPr>
+            <w:tcW w:type="dxa" w:w="1837"/>
+          </w:tcPr>
+          <w:p>
+            <w:r/>
+            <w:r>
+              <w:rPr>
+                <w:sz w:val="17"/>
+                <w:rFonts w:eastAsia="宋体" w:ascii="Microsoft YaHei" w:hAnsi="Microsoft YaHei"/>
+              </w:rPr>
+              <w:t>0.20</w:t>
             </w:r>
           </w:p>
         </w:tc>
@@ -14683,7 +14765,20 @@
         <w:rPr>
           <w:rFonts w:eastAsia="宋体" w:ascii="Microsoft YaHei" w:hAnsi="Microsoft YaHei"/>
         </w:rPr>
-        <w:t>峰值 ≤-12 dBFS（NFR-6）；暂停时挂起（FR-6.3）。</w:t>
+        <w:t xml:space="preserve">峰值 ≤-12 dBFS（NFR-6）：所有音效先经 </w:t>
+      </w:r>
+      <w:r>
+        <w:rPr>
+          <w:rFonts w:ascii="Consolas" w:hAnsi="Consolas" w:eastAsia="宋体"/>
+          <w:sz w:val="19"/>
+        </w:rPr>
+        <w:t>DynamicsCompressor</w:t>
+      </w:r>
+      <w:r>
+        <w:rPr>
+          <w:rFonts w:eastAsia="宋体" w:ascii="Microsoft YaHei" w:hAnsi="Microsoft YaHei"/>
+        </w:rPr>
+        <w:t>（threshold -12dB、ratio 20）限幅再进扬声器；暂停时挂起（FR-6.3）。静音状态被持久化时，HUD 显示「音效已关闭」文字提示，被浏览器拦截自动播放时显示「点一下开启音效」并补播被拦下的那次音效——声音问题不再只能靠猜。</w:t>
       </w:r>
     </w:p>
     <w:p>

</xml_diff>

<commit_message>
fix(audio): hard-clip limiter instead of DynamicsCompressor (NFR-6)
Verified with an OfflineAudioContext replica of the master chain: Chrome's
DynamicsCompressor applies makeup gain, so three overlapping 0.13 sounds
peaked at 0.612 instead of the 0.251 ceiling (0.376 without it). Replace it
with a WaveShaper clipping at ±0.25 (-12 dBFS), expose verifyLimiter() and
assert the rendered peak in e2e S8.14.
</commit_message>
<xml_diff>
--- a/docs/PRD-v1.2.docx
+++ b/docs/PRD-v1.2.docx
@@ -1210,7 +1210,21 @@
                 <w:sz w:val="17"/>
                 <w:rFonts w:eastAsia="宋体" w:ascii="Microsoft YaHei" w:hAnsi="Microsoft YaHei"/>
               </w:rPr>
-              <w:t xml:space="preserve"> 验收脚本。补充：音效电平按 NFR-6 预算上调并加 -12 dBFS 限幅器，静音/被拦截时 HUD 给文字提示并补播，新增音效端到端验收（S8/S9）</w:t>
+              <w:t xml:space="preserve"> 验收脚本。补充：音效电平按 NFR-6 预算上调、改用硬削波限幅（</w:t>
+            </w:r>
+            <w:r>
+              <w:rPr>
+                <w:rFonts w:ascii="Consolas" w:hAnsi="Consolas" w:eastAsia="宋体"/>
+                <w:sz w:val="17"/>
+              </w:rPr>
+              <w:t>DynamicsCompressor</w:t>
+            </w:r>
+            <w:r>
+              <w:rPr>
+                <w:sz w:val="17"/>
+                <w:rFonts w:eastAsia="宋体" w:ascii="Microsoft YaHei" w:hAnsi="Microsoft YaHei"/>
+              </w:rPr>
+              <w:t xml:space="preserve"> 实测会抬高峰值，已弃用）、静音/被拦截时 HUD 给文字提示并补播，新增音效端到端验收（S8/S9）</w:t>
             </w:r>
           </w:p>
         </w:tc>
@@ -14765,7 +14779,20 @@
         <w:rPr>
           <w:rFonts w:eastAsia="宋体" w:ascii="Microsoft YaHei" w:hAnsi="Microsoft YaHei"/>
         </w:rPr>
-        <w:t xml:space="preserve">峰值 ≤-12 dBFS（NFR-6）：所有音效先经 </w:t>
+        <w:t xml:space="preserve">峰值 ≤-12 dBFS（NFR-6）：所有音效经 </w:t>
+      </w:r>
+      <w:r>
+        <w:rPr>
+          <w:rFonts w:ascii="Consolas" w:hAnsi="Consolas" w:eastAsia="宋体"/>
+          <w:sz w:val="19"/>
+        </w:rPr>
+        <w:t>WaveShaper</w:t>
+      </w:r>
+      <w:r>
+        <w:rPr>
+          <w:rFonts w:eastAsia="宋体" w:ascii="Microsoft YaHei" w:hAnsi="Microsoft YaHei"/>
+        </w:rPr>
+        <w:t xml:space="preserve"> 硬削波（±0.25 ≈ -12 dBFS）后进扬声器——不用 </w:t>
       </w:r>
       <w:r>
         <w:rPr>
@@ -14778,7 +14805,20 @@
         <w:rPr>
           <w:rFonts w:eastAsia="宋体" w:ascii="Microsoft YaHei" w:hAnsi="Microsoft YaHei"/>
         </w:rPr>
-        <w:t>（threshold -12dB、ratio 20）限幅再进扬声器；暂停时挂起（FR-6.3）。静音状态被持久化时，HUD 显示「音效已关闭」文字提示，被浏览器拦截自动播放时显示「点一下开启音效」并补播被拦下的那次音效——声音问题不再只能靠猜。</w:t>
+        <w:t>，实测它带补偿增益，3 个音效叠加时峰值从 0.376 被抬到 0.612。</w:t>
+      </w:r>
+      <w:r>
+        <w:rPr>
+          <w:rFonts w:ascii="Consolas" w:hAnsi="Consolas" w:eastAsia="宋体"/>
+          <w:sz w:val="19"/>
+        </w:rPr>
+        <w:t>NeonSerpent.verifyLimiter()</w:t>
+      </w:r>
+      <w:r>
+        <w:rPr>
+          <w:rFonts w:eastAsia="宋体" w:ascii="Microsoft YaHei" w:hAnsi="Microsoft YaHei"/>
+        </w:rPr>
+        <w:t xml:space="preserve"> 用同一套图离线复算，端到端断言峰值 ≤0.2512（S8.14）。暂停时挂起（FR-6.3）。静音状态被持久化时，HUD 显示「音效已关闭」文字提示，被浏览器拦截自动播放时显示「点一下开启音效」并补播被拦下的那次音效——声音问题不再只能靠猜。</w:t>
       </w:r>
     </w:p>
     <w:p>

</xml_diff>